<commit_message>
fix(build_manuscript): update manuscript content and figures for clarity and accuracy
</commit_message>
<xml_diff>
--- a/논문_food_waste_robot.docx
+++ b/논문_food_waste_robot.docx
@@ -11,7 +11,7 @@
           <w:rFonts w:ascii="Times New Roman" w:hAnsi="Times New Roman"/>
           <w:b/>
         </w:rPr>
-        <w:t>공동주택 음식물 쓰레기 자율 수거를 위한 저비용 임베디드 시제품 개발</w:t>
+        <w:t>공동주택 음식물 쓰레기통 자율 수거를 위한 저비용 임베디드 시제품 개발</w:t>
       </w:r>
     </w:p>
     <w:p>
@@ -53,7 +53,7 @@
           <w:rFonts w:ascii="Times New Roman" w:hAnsi="Times New Roman"/>
           <w:b/>
         </w:rPr>
-        <w:t>Development of a Low-Cost Embedded Prototype for Autonomous Food Waste Collection in Residential Complexes</w:t>
+        <w:t>Development of a Low-Cost Embedded Prototype for Autonomous Collection of Food-Waste Bins in Residential Complexes</w:t>
       </w:r>
     </w:p>
     <w:p>
@@ -643,7 +643,30 @@
           <w:rFonts w:ascii="Times New Roman" w:hAnsi="Times New Roman"/>
           <w:b w:val="0"/>
         </w:rPr>
-        <w:t>시제품의 주요 부품 구성은 Table 2와 같다. 제어부는 비전·미션 처리를 담당하는 Raspberry Pi 4와 실시간 센서·구동 제어를 담당하는 Arduino Mega로 이원화하였다. 고수준 인지·계획은 Linux 기반 Raspberry Pi가, 결정론적 실시간 제어와 안전 정지는 마이크로컨트롤러가 담당함으로써 안전성과 유연성을 동시에 확보한다. 초기 설계에서는 옥외 자율주행을 위한 GPS 측위 모듈을 포함할 계획이었으나, 시제품 단계의 예산 제약과 단지 내 고층 건물에 의한 위성 신호 음영을 고려하여 GPS를 배제하고, 초음파 센서·Raspberry Pi 카메라·USB 웹캠·관성 센서를 결합한 저비용 센서 구성으로 대체하였다. 이는 고가의 측위 장비 없이도 단지 환경에서 자율 수거가 가능함을 보이려는 본 연구의 지향과 일치한다. 두 제어기는 USB 시리얼로 연결되며, 로직용 7.4 V 배터리와 구동용 12 V 배터리를 분리한 듀얼 배터리 전원 구조(Fig. 2)를 채택해 모터 노이즈의 제어부 유입을 억제하였다.</w:t>
+        <w:t>시제품의 외형과 6층 적층 구조는 Fig. 2, 주요 부품 구성은 Table 2와 같다. 제어부는 비전·미션 처리를 담당하는 Raspberry Pi 4와 실시간 센서·구동 제어를 담당하는 Arduino Mega로 이원화하였다. 고수준 인지·계획은 Linux 기반 Raspberry Pi가, 결정론적 실시간 제어와 안전 정지는 마이크로컨트롤러가 담당함으로써 안전성과 유연성을 동시에 확보한다. 초기 설계에서는 옥외 자율주행을 위한 GPS 측위 모듈을 포함할 계획이었으나, 시제품 단계의 예산 제약과 단지 내 고층 건물에 의한 위성 신호 음영을 고려하여 GPS를 배제하고, 초음파 센서·Raspberry Pi 카메라·USB 웹캠·관성 센서를 결합한 저비용 센서 구성으로 대체하였다. 이는 고가의 측위 장비 없이도 단지 환경에서 자율 수거가 가능함을 보이려는 본 연구의 지향과 일치한다. 두 제어기는 USB 시리얼로 연결되며, 로직용 7.4 V 배터리와 구동용 12 V 배터리를 분리한 듀얼 배터리 전원 구조(Fig. 3)를 채택해 모터 노이즈의 제어부 유입을 억제하였다.</w:t>
+      </w:r>
+    </w:p>
+    <w:p>
+      <w:pPr>
+        <w:pStyle w:val="a2"/>
+      </w:pPr>
+      <w:r>
+        <w:rPr>
+          <w:rFonts w:ascii="Times New Roman" w:hAnsi="Times New Roman"/>
+          <w:i/>
+        </w:rPr>
+        <w:t>[ Figure placeholder — 이미지 삽입 필요 ]</w:t>
+      </w:r>
+    </w:p>
+    <w:p>
+      <w:pPr>
+        <w:pStyle w:val="a2"/>
+      </w:pPr>
+      <w:r>
+        <w:rPr>
+          <w:rFonts w:ascii="Times New Roman" w:hAnsi="Times New Roman"/>
+        </w:rPr>
+        <w:t>Fig. 2 Appearance of the prototype robot and its six-layer mechanical stack</w:t>
       </w:r>
     </w:p>
     <w:p>
@@ -876,7 +899,7 @@
         <w:rPr>
           <w:rFonts w:ascii="Times New Roman" w:hAnsi="Times New Roman"/>
         </w:rPr>
-        <w:t>Fig. 2 Dual-battery power architecture separating the 7.4 V logic supply from the 12 V drive supply</w:t>
+        <w:t>Fig. 3 Dual-battery power architecture separating the 7.4 V logic supply from the 12 V drive supply</w:t>
       </w:r>
     </w:p>
     <w:p>
@@ -947,7 +970,30 @@
           <w:rFonts w:ascii="Times New Roman" w:hAnsi="Times New Roman"/>
           <w:b w:val="0"/>
         </w:rPr>
-        <w:t>을 사용한다. 평가 함수는 f(n) = g(n) + h(n) 이며, 8방향 이동을 허용하고 대각 이동 비용을 √2 로 부여한다. 휴리스틱 h(n) 으로는 8방향 이동에 일관적인 옥타일 거리(octile distance)를 사용한다. 장애물 주변에는 팽창 반경 r_infl 을 적용해 비용을 가중함으로써 ROS 2 Nav2의 InflationLayer 동작을 모사하였으며, 이는 향후 Nav2 NavFn 계획기로의 이식을 용이하게 하기 위한 의도적 설계이다.</w:t>
+        <w:t>을 사용한다. 평가 함수는 f(n) = g(n) + h(n) 이며, 8방향 이동을 허용하고 대각 이동 비용을 √2 로 부여한다. 휴리스틱 h(n) 으로는 8방향 이동에 일관적인 옥타일 거리(octile distance)를 사용한다. 장애물 주변에는 팽창 반경 r_infl 을 적용해 비용을 가중함으로써 ROS 2 Nav2의 InflationLayer 동작을 모사하였으며, 이는 향후 Nav2 NavFn 계획기로의 이식을 용이하게 하기 위한 의도적 설계이다. 전역 경로와 장애물 팽창 비용의 적용 예를 Fig. 4에 나타냈다.</w:t>
+      </w:r>
+    </w:p>
+    <w:p>
+      <w:pPr>
+        <w:pStyle w:val="a2"/>
+      </w:pPr>
+      <w:r>
+        <w:rPr>
+          <w:rFonts w:ascii="Times New Roman" w:hAnsi="Times New Roman"/>
+          <w:i/>
+        </w:rPr>
+        <w:t>[ Figure placeholder — 이미지 삽입 필요 ]</w:t>
+      </w:r>
+    </w:p>
+    <w:p>
+      <w:pPr>
+        <w:pStyle w:val="a2"/>
+      </w:pPr>
+      <w:r>
+        <w:rPr>
+          <w:rFonts w:ascii="Times New Roman" w:hAnsi="Times New Roman"/>
+        </w:rPr>
+        <w:t>Fig. 4 A* global path with obstacle inflation on the prototype map</w:t>
       </w:r>
     </w:p>
     <w:p>
@@ -1021,7 +1067,30 @@
           <w:rFonts w:ascii="Times New Roman" w:hAnsi="Times New Roman"/>
           <w:b w:val="0"/>
         </w:rPr>
-        <w:t>과 측·후방 초음파를 융합하여 보행자 및 장애물을 감지한다.</w:t>
+        <w:t>과 측·후방 초음파를 융합하여 보행자 및 장애물을 감지한다. QR 코드 기반 빈 식별과 접근 정렬 과정을 Fig. 5에 나타냈다.</w:t>
+      </w:r>
+    </w:p>
+    <w:p>
+      <w:pPr>
+        <w:pStyle w:val="a2"/>
+      </w:pPr>
+      <w:r>
+        <w:rPr>
+          <w:rFonts w:ascii="Times New Roman" w:hAnsi="Times New Roman"/>
+          <w:i/>
+        </w:rPr>
+        <w:t>[ Figure placeholder — 이미지 삽입 필요 ]</w:t>
+      </w:r>
+    </w:p>
+    <w:p>
+      <w:pPr>
+        <w:pStyle w:val="a2"/>
+      </w:pPr>
+      <w:r>
+        <w:rPr>
+          <w:rFonts w:ascii="Times New Roman" w:hAnsi="Times New Roman"/>
+        </w:rPr>
+        <w:t>Fig. 5 QR-code-based bin identification and approach alignment</w:t>
       </w:r>
     </w:p>
     <w:p>
@@ -1044,7 +1113,7 @@
           <w:rFonts w:ascii="Times New Roman" w:hAnsi="Times New Roman"/>
           <w:b w:val="0"/>
         </w:rPr>
-        <w:t>수거 미션은 Fig. 3과 같이 IDLE → NAV_TO_BIN → APPROACH → PICKUP → NAV_TO_DEPOT → DROP 의 유한 상태머신으로 구성된다. APPROACH 단계에서 목표 QR이 일치하고 30 cm 이내로 접근하면 롤러를 구동해 수거(PICKUP)하고, 집하장으로 이동한 뒤 역방향 롤러로 배출(DROP)한다. 한편 Arduino는 상위 제어기의 명령보다 우선하는 독립 안전 정지 로직을 수행하여, 전방 장애물이 15 cm 미만이고 전진 중이면 즉시 정지하고, 500 ms 이상 명령이 없으면 워치독에 의해 정지한다. 안전 정지 발생 시 상위 제어기는 후진·회전으로 회피한 뒤 미션을 재개한다.</w:t>
+        <w:t>수거 미션은 Fig. 6과 같이 IDLE → NAV_TO_BIN → APPROACH → PICKUP → NAV_TO_DEPOT → DROP 의 유한 상태머신으로 구성된다. APPROACH 단계에서 목표 QR이 일치하고 30 cm 이내로 접근하면 롤러를 구동해 수거(PICKUP)하고, 집하장으로 이동한 뒤 역방향 롤러로 배출(DROP)한다. 한편 Arduino는 상위 제어기의 명령보다 우선하는 독립 안전 정지 로직을 수행하여, 전방 장애물이 15 cm 미만이고 전진 중이면 즉시 정지하고, 500 ms 이상 명령이 없으면 워치독에 의해 정지한다. 안전 정지 발생 시 상위 제어기는 후진·회전으로 회피한 뒤 미션을 재개한다.</w:t>
       </w:r>
     </w:p>
     <w:p>
@@ -1067,7 +1136,7 @@
         <w:rPr>
           <w:rFonts w:ascii="Times New Roman" w:hAnsi="Times New Roman"/>
         </w:rPr>
-        <w:t>Fig. 3 Finite-state machine of the collection mission</w:t>
+        <w:t>Fig. 6 Finite-state machine of the collection mission</w:t>
       </w:r>
     </w:p>
     <w:p>
@@ -1101,7 +1170,30 @@
           <w:rFonts w:ascii="Times New Roman" w:hAnsi="Times New Roman"/>
           <w:b w:val="0"/>
         </w:rPr>
-        <w:t>실험은 시제품 테스트 환경을 모사한 40x30 격자(장애물 셀 306개, 건물 4동·놀이터·주차장 포함)에서 수행하였다. 빈 4개와 로봇 2대, 중앙 집하장을 배치하였으며, 경로 탐색은 기본 팽창 반경 r_infl = 2, 시제품 공칭 속도 v = 0.3 cells/s, 빈당 수거 시간 3 s 를 적용하였다. 모든 수치는 실제 백엔드 알고리즘 구현을 그대로 실행하여 산출하였으며 난수 시드를 고정해 재현성을 확보하였다. 본 절의 결과는 시뮬레이션 기반 분석으로, 실물 하드웨어 계측은 향후 과제로 남긴다.</w:t>
+        <w:t>실험은 시제품 테스트 환경을 모사한 40x30 격자(장애물 셀 306개, 건물 4동·놀이터·주차장 포함)에서 수행하였다(Fig. 7). 빈 4개와 로봇 2대, 중앙 집하장을 배치하였으며, 경로 탐색은 기본 팽창 반경 r_infl = 2, 시제품 공칭 속도 v = 0.3 cells/s, 빈당 수거 시간 3 s 를 적용하였다. 모든 수치는 실제 백엔드 알고리즘 구현을 그대로 실행하여 산출하였으며 난수 시드를 고정해 재현성을 확보하였다. 본 절의 결과는 시뮬레이션 기반 분석으로, 실물 하드웨어 계측은 향후 과제로 남긴다.</w:t>
+      </w:r>
+    </w:p>
+    <w:p>
+      <w:pPr>
+        <w:pStyle w:val="a2"/>
+      </w:pPr>
+      <w:r>
+        <w:rPr>
+          <w:rFonts w:ascii="Times New Roman" w:hAnsi="Times New Roman"/>
+          <w:i/>
+        </w:rPr>
+        <w:t>[ Figure placeholder — 이미지 삽입 필요 ]</w:t>
+      </w:r>
+    </w:p>
+    <w:p>
+      <w:pPr>
+        <w:pStyle w:val="a2"/>
+      </w:pPr>
+      <w:r>
+        <w:rPr>
+          <w:rFonts w:ascii="Times New Roman" w:hAnsi="Times New Roman"/>
+        </w:rPr>
+        <w:t>Fig. 7 Prototype experiment environment: 40x30 grid with four bins, two robots, and a central depot</w:t>
       </w:r>
     </w:p>
     <w:p>
@@ -1399,7 +1491,7 @@
           <w:rFonts w:ascii="Times New Roman" w:hAnsi="Times New Roman"/>
           <w:b w:val="0"/>
         </w:rPr>
-        <w:t>팽창 반경 r_infl 을 0 에서 4 까지 변화시키며 단일 로봇 미션 경로를 분석하였다(Table 4). r_infl 이 증가할수록 경로의 평균 장애물 이격 거리는 2.07 에서 2.88 cells 로 증가하여 더 안전한 여유 공간을 확보하는 반면, 총 경로 길이는 63.31 에서 71.6 cells 로 늘고 A* 질의당 계산 시간도 0.222 에서 6.987 ms 로 증가한다. 최소 이격 거리가 1 cell 로 일정한 것은 빈과 집하장이 건물·구조물에 인접해 있어 출발·도착 구간에서 근접이 불가피하기 때문이며, 이 trade-off를 고려해 본 연구는 r_infl = 2 를 기본값으로 채택하였다.</w:t>
+        <w:t>팽창 반경 r_infl 을 0 에서 4 까지 변화시키며 단일 로봇 미션 경로를 분석하였다(Table 4, Fig. 8(a)). r_infl 이 증가할수록 경로의 평균 장애물 이격 거리는 2.07 에서 2.88 cells 로 증가하여 더 안전한 여유 공간을 확보하는 반면, 총 경로 길이는 63.31 에서 71.6 cells 로 늘고 A* 질의당 계산 시간도 0.222 에서 6.987 ms 로 증가한다. 최소 이격 거리가 1 cell 로 일정한 것은 빈과 집하장이 건물·구조물에 인접해 있어 출발·도착 구간에서 근접이 불가피하기 때문이며, 이 trade-off를 고려해 본 연구는 r_infl = 2 를 기본값으로 채택하였다.</w:t>
       </w:r>
     </w:p>
     <w:p>
@@ -1804,7 +1896,7 @@
           <w:rFonts w:ascii="Times New Roman" w:hAnsi="Times New Roman"/>
           <w:b w:val="0"/>
         </w:rPr>
-        <w:t>실제 4-bin 레이아웃에서 최근접 이웃 휴리스틱은 완전 탐색 최적해와 동일한 경로를 산출하여 최적성 격차가 0.0% 였다. 빈 개수를 4 에서 8 까지 늘린 무작위 인스턴스 (30회 평균)에서는 평균 격차가 N=4 의 4.3% 에서 N=8 의 10.51% 로 증가하였다(Table 5). 이는 소규모 빈 배치에서는 최근접 이웃 휴리스틱이 최적에 근접하나, 빈 수가 많아지는 대규모 단지에서는 2-opt 등 개선된 TSP 기법이 필요함을 시사한다.</w:t>
+        <w:t>실제 4-bin 레이아웃에서 최근접 이웃 휴리스틱은 완전 탐색 최적해와 동일한 경로를 산출하여 최적성 격차가 0.0% 였다. 빈 개수를 4 에서 8 까지 늘린 무작위 인스턴스 (30회 평균)에서는 평균 격차가 N=4 의 4.3% 에서 N=8 의 10.51% 로 증가하였다(Table 5, Fig. 8(b)). 이는 소규모 빈 배치에서는 최근접 이웃 휴리스틱이 최적에 근접하나, 빈 수가 많아지는 대규모 단지에서는 2-opt 등 개선된 TSP 기법이 필요함을 시사한다.</w:t>
       </w:r>
     </w:p>
     <w:p>
@@ -2267,7 +2359,7 @@
           <w:rFonts w:ascii="Times New Roman" w:hAnsi="Times New Roman"/>
           <w:b w:val="0"/>
         </w:rPr>
-        <w:t>풀스케일 단지로의 확장 가능성을 확인하기 위해 빈 격자 크기를 40x30 에서 200x140 까지 늘리며 대각선 경로 질의의 계산 시간을 측정하였다(Table 6). 격자 셀 수가 1200 에서 28000 로 약 23배 증가하는 동안 질의 시간은 3.239 에서 48.367 ms 로 증가하여, 가장 큰 200x140 격자에서도 50 ms 미만의 실시간 성능을 보였다. 이는 제안 경로 탐색이 실제 아파트 단지 규모에서도 실시간으로 동작 가능함을 의미한다.</w:t>
+        <w:t>풀스케일 단지로의 확장 가능성을 확인하기 위해 빈 격자 크기를 40x30 에서 200x140 까지 늘리며 대각선 경로 질의의 계산 시간을 측정하였다(Table 6, Fig. 8(c)). 격자 셀 수가 1200 에서 28000 로 약 23배 증가하는 동안 질의 시간은 3.239 에서 48.367 ms 로 증가하여, 가장 큰 200x140 격자에서도 50 ms 미만의 실시간 성능을 보였다. 이는 제안 경로 탐색이 실제 아파트 단지 규모에서도 실시간으로 동작 가능함을 의미한다.</w:t>
       </w:r>
     </w:p>
     <w:p>
@@ -2652,6 +2744,29 @@
         </w:tc>
       </w:tr>
     </w:tbl>
+    <w:p>
+      <w:pPr>
+        <w:pStyle w:val="a2"/>
+      </w:pPr>
+      <w:r>
+        <w:rPr>
+          <w:rFonts w:ascii="Times New Roman" w:hAnsi="Times New Roman"/>
+          <w:i/>
+        </w:rPr>
+        <w:t>[ Figure placeholder — 이미지 삽입 필요 ]</w:t>
+      </w:r>
+    </w:p>
+    <w:p>
+      <w:pPr>
+        <w:pStyle w:val="a2"/>
+      </w:pPr>
+      <w:r>
+        <w:rPr>
+          <w:rFonts w:ascii="Times New Roman" w:hAnsi="Times New Roman"/>
+        </w:rPr>
+        <w:t>Fig. 8 Experimental results: (a) inflation-radius trade-off, (b) nearest-neighbor optimality gap, (c) path-planning scalability</w:t>
+      </w:r>
+    </w:p>
     <w:p>
       <w:pPr>
         <w:pStyle w:val="a"/>

</xml_diff>